<commit_message>
Add historical season data import, paper chapter 3 tooling, and misc fixes
Imports 2564-2567 match/participant data with import scripts and source
images, adds a gridgeist Claude Code skill, updates paper chapter 3
diagram/build scripts and merged thesis docx, and carries small fixes
across the tournament API/serializers/service layer and frontend admin
pages.

Co-Authored-By: Claude Sonnet 5 <noreply@anthropic.com>
</commit_message>
<xml_diff>
--- a/paper/บทที่3_การวิเคราะห์และออกแบบระบบ.docx
+++ b/paper/บทที่3_การวิเคราะห์และออกแบบระบบ.docx
@@ -357,7 +357,7 @@
                 <w:sz w:val="28"/>
                 <w:szCs w:val="28"/>
               </w:rPr>
-              <w:t>บันทึกการแข่งขัน สร้างรุ่นมัธยมศึกษาตอนต้น/ตอนปลาย และเปิดใช้งานการแข่งขันของปีนั้น</w:t>
+              <w:t>บันทึกการแข่งขัน (จัดได้มากกว่าหนึ่งครั้งต่อปีโดยแยกด้วยครั้งที่ของการแข่งขัน) สร้างรุ่นมัธยมศึกษาตอนต้น/ตอนปลาย และเปิดใช้งานการแข่งขันรายการนั้น</w:t>
             </w:r>
           </w:p>
         </w:tc>
@@ -1460,7 +1460,7 @@
           <w:sz w:val="32"/>
           <w:szCs w:val="32"/>
         </w:rPr>
-        <w:t>ระบบใช้ฐานข้อมูลเชิงสัมพันธ์ (MariaDB) ที่ผ่านการทำ Normalization ประกอบด้วยตาราง 9 ตาราง โดยมีโครงสร้างความสัมพันธ์หลักแบบลำดับชั้น คือ การแข่งขัน (tournaments) หนึ่งรายการมีได้หลายรุ่น (divisions) แต่ละรุ่นประกอบด้วยหลายรอบ (rounds) แต่ละรอบมีหลายคู่แข่งขัน (matches) และแต่ละคู่แข่งขันประกอบด้วยหลายเกมตามรูปแบบ Best of (match_games) ส่วนทีม (teams) สังกัดรุ่นและโรงเรียน (schools) โดยมีสมาชิกทีม (team_members) ทีมละ 5 คน ทั้งนี้ตารางคู่แข่งขันมีความสัมพันธ์อ้างอิงตนเอง (next_match_id) เพื่อระบุคู่แข่งขันถัดไปที่ทีมชนะจะเลื่อนเข้าสู่รอบต่อไป และตารางเกมการแข่งขันอ้างอิงผู้ใช้งาน (users) ทั้งผู้อัปโหลดภาพหลักฐานและผู้ยืนยันผล ดังภาพที่ 3.11</w:t>
+        <w:t>ระบบใช้ฐานข้อมูลเชิงสัมพันธ์ (MariaDB) ที่ผ่านการทำ Normalization ประกอบด้วยตาราง 9 ตาราง โดยมีโครงสร้างความสัมพันธ์หลักแบบลำดับชั้น คือ การแข่งขัน (tournaments) หนึ่งรายการมีได้หลายรุ่น (divisions) แต่ละรุ่นประกอบด้วยหลายรอบ (rounds) แต่ละรอบมีหลายคู่แข่งขัน (matches) และแต่ละคู่แข่งขันประกอบด้วยหลายเกมตามรูปแบบ Best of (match_games) ส่วนทีม (teams) สังกัดรุ่นและโรงเรียน (schools) โดยมีสมาชิกทีม (team_members) ทีมละ 5 คน ทั้งนี้ตารางคู่แข่งขันมีความสัมพันธ์อ้างอิงตนเอง (next_match_id) เพื่อระบุคู่แข่งขันถัดไปที่ทีมชนะจะเลื่อนเข้าสู่รอบต่อไป และตารางเกมการแข่งขันอ้างอิงผู้ใช้งาน (users) ทั้งผู้อัปโหลดภาพหลักฐานและผู้ยืนยันผล โดยการแข่งขันแต่ละรายการระบุเอกลักษณ์ด้วยคู่ของปีและครั้งที่ (year, season) เพื่อรองรับการจัดการแข่งขันมากกว่าหนึ่งครั้งภายในปีเดียวกัน ดังภาพที่ 3.11</w:t>
       </w:r>
     </w:p>
     <w:p>
@@ -1556,7 +1556,7 @@
           <w:sz w:val="32"/>
           <w:szCs w:val="32"/>
         </w:rPr>
-        <w:t>พจนานุกรมข้อมูลอธิบายรายละเอียดโครงสร้างของตารางในฐานข้อมูลทั้ง 9 ตาราง ประกอบด้วยชื่อฟิลด์ ชนิดข้อมูล คำอธิบาย และประเภทคีย์ โดย PK หมายถึงคีย์หลัก (Primary Key) FK หมายถึงคีย์นอก (Foreign Key) และ UQ หมายถึงฟิลด์ที่กำหนดค่าห้ามซ้ำ (Unique) ดังตารางที่ 3.2 ถึงตารางที่ 3.10</w:t>
+        <w:t>พจนานุกรมข้อมูลอธิบายรายละเอียดโครงสร้างของตารางในฐานข้อมูลทั้ง 9 ตาราง ประกอบด้วยชื่อฟิลด์ ชนิดข้อมูล คำอธิบาย และประเภทคีย์ โดย PK หมายถึงคีย์หลัก (Primary Key) FK หมายถึงคีย์นอก (Foreign Key) และ UQ หมายถึงฟิลด์ที่กำหนดค่าห้ามซ้ำ (Unique) ทั้งนี้กรณีที่หลายฟิลด์ในตารางเดียวกันกำกับ UQ ร่วมกัน หมายถึงการห้ามซ้ำแบบผสม (Composite Unique) เช่น ฟิลด์ year และ season ของตารางการแข่งขัน ดังตารางที่ 3.2 ถึงตารางที่ 3.10</w:t>
       </w:r>
     </w:p>
     <w:p>
@@ -2930,7 +2930,7 @@
                 <w:sz w:val="28"/>
                 <w:szCs w:val="28"/>
               </w:rPr>
-              <w:t>ปี พ.ศ. ของการแข่งขัน (ห้ามซ้ำ)</w:t>
+              <w:t>ปี พ.ศ. ของการแข่งขัน (ห้ามซ้ำร่วมกับ season)</w:t>
             </w:r>
           </w:p>
         </w:tc>
@@ -2986,7 +2986,7 @@
                 <w:sz w:val="28"/>
                 <w:szCs w:val="28"/>
               </w:rPr>
-              <w:t>is_active</w:t>
+              <w:t>season</w:t>
             </w:r>
           </w:p>
         </w:tc>
@@ -3002,7 +3002,7 @@
                 <w:sz w:val="28"/>
                 <w:szCs w:val="28"/>
               </w:rPr>
-              <w:t>TINYINT(1)</w:t>
+              <w:t>SMALLINT UNSIGNED</w:t>
             </w:r>
           </w:p>
         </w:tc>
@@ -3018,7 +3018,7 @@
                 <w:sz w:val="28"/>
                 <w:szCs w:val="28"/>
               </w:rPr>
-              <w:t>สถานะการแข่งขันที่เปิดใช้งาน (เปิดได้ครั้งละ 1 รายการ)</w:t>
+              <w:t>ครั้งที่ของการแข่งขันภายในปีเดียวกัน (ค่าเริ่มต้น 1, ห้ามซ้ำร่วมกับ year)</w:t>
             </w:r>
           </w:p>
         </w:tc>
@@ -3037,6 +3037,7 @@
                 <w:sz w:val="28"/>
                 <w:szCs w:val="28"/>
               </w:rPr>
+              <w:t>UQ</w:t>
             </w:r>
           </w:p>
         </w:tc>
@@ -3058,6 +3059,93 @@
                 <w:szCs w:val="28"/>
               </w:rPr>
               <w:t>5</w:t>
+            </w:r>
+          </w:p>
+        </w:tc>
+        <w:tc>
+          <w:tcPr>
+            <w:tcW w:type="dxa" w:w="2381"/>
+          </w:tcPr>
+          <w:p>
+            <w:r>
+              <w:rPr>
+                <w:rFonts w:ascii="TH SarabunPSK" w:hAnsi="TH SarabunPSK" w:cs="TH SarabunPSK"/>
+                <w:b w:val="0"/>
+                <w:sz w:val="28"/>
+                <w:szCs w:val="28"/>
+              </w:rPr>
+              <w:t>is_active</w:t>
+            </w:r>
+          </w:p>
+        </w:tc>
+        <w:tc>
+          <w:tcPr>
+            <w:tcW w:type="dxa" w:w="1928"/>
+          </w:tcPr>
+          <w:p>
+            <w:r>
+              <w:rPr>
+                <w:rFonts w:ascii="TH SarabunPSK" w:hAnsi="TH SarabunPSK" w:cs="TH SarabunPSK"/>
+                <w:b w:val="0"/>
+                <w:sz w:val="28"/>
+                <w:szCs w:val="28"/>
+              </w:rPr>
+              <w:t>TINYINT(1)</w:t>
+            </w:r>
+          </w:p>
+        </w:tc>
+        <w:tc>
+          <w:tcPr>
+            <w:tcW w:type="dxa" w:w="3515"/>
+          </w:tcPr>
+          <w:p>
+            <w:r>
+              <w:rPr>
+                <w:rFonts w:ascii="TH SarabunPSK" w:hAnsi="TH SarabunPSK" w:cs="TH SarabunPSK"/>
+                <w:b w:val="0"/>
+                <w:sz w:val="28"/>
+                <w:szCs w:val="28"/>
+              </w:rPr>
+              <w:t>สถานะการแข่งขันที่เปิดใช้งาน (เปิดได้ครั้งละ 1 รายการ)</w:t>
+            </w:r>
+          </w:p>
+        </w:tc>
+        <w:tc>
+          <w:tcPr>
+            <w:tcW w:type="dxa" w:w="1474"/>
+          </w:tcPr>
+          <w:p>
+            <w:pPr>
+              <w:jc w:val="center"/>
+            </w:pPr>
+            <w:r>
+              <w:rPr>
+                <w:rFonts w:ascii="TH SarabunPSK" w:hAnsi="TH SarabunPSK" w:cs="TH SarabunPSK"/>
+                <w:b w:val="0"/>
+                <w:sz w:val="28"/>
+                <w:szCs w:val="28"/>
+              </w:rPr>
+            </w:r>
+          </w:p>
+        </w:tc>
+      </w:tr>
+      <w:tr>
+        <w:tc>
+          <w:tcPr>
+            <w:tcW w:type="dxa" w:w="794"/>
+          </w:tcPr>
+          <w:p>
+            <w:pPr>
+              <w:jc w:val="center"/>
+            </w:pPr>
+            <w:r>
+              <w:rPr>
+                <w:rFonts w:ascii="TH SarabunPSK" w:hAnsi="TH SarabunPSK" w:cs="TH SarabunPSK"/>
+                <w:b w:val="0"/>
+                <w:sz w:val="28"/>
+                <w:szCs w:val="28"/>
+              </w:rPr>
+              <w:t>6</w:t>
             </w:r>
           </w:p>
         </w:tc>

</xml_diff>